<commit_message>
Renamed the temp folder into v1 folder and changed the /temp/ into /v1/
This commits contains all the modification for the APIS and its folder.

The purpose of changing the temp name into v1 is for the versioning of the apis because assuming that the api will improve later on. So  Versioning it in a proper way would be the best setup
</commit_message>
<xml_diff>
--- a/documentations/Additional Features for Warehouse Program.docx
+++ b/documentations/Additional Features for Warehouse Program.docx
@@ -503,6 +503,23 @@
     <w:p>
       <w:pPr>
         <w:pStyle w:val="ListParagraph"/>
+        <w:numPr>
+          <w:ilvl w:val="0"/>
+          <w:numId w:val="1"/>
+        </w:numPr>
+      </w:pPr>
+      <w:r>
+        <w:lastRenderedPageBreak/>
+        <w:t>Improve the performance of the RM CONSUMPTION ENTRY</w:t>
+      </w:r>
+    </w:p>
+    <w:p>
+      <w:pPr>
+        <w:pStyle w:val="ListParagraph"/>
+        <w:numPr>
+          <w:ilvl w:val="1"/>
+          <w:numId w:val="1"/>
+        </w:numPr>
       </w:pPr>
     </w:p>
     <w:sectPr>

</xml_diff>

<commit_message>
STATUS BACKEND API: Convert the droplist into status
</commit_message>
<xml_diff>
--- a/documentations/Additional Features for Warehouse Program.docx
+++ b/documentations/Additional Features for Warehouse Program.docx
@@ -455,12 +455,14 @@
         <w:rPr>
           <w:b/>
           <w:bCs/>
-        </w:rPr>
-      </w:pPr>
-      <w:r>
-        <w:rPr>
-          <w:b/>
-          <w:bCs/>
+          <w:strike/>
+        </w:rPr>
+      </w:pPr>
+      <w:r>
+        <w:rPr>
+          <w:b/>
+          <w:bCs/>
+          <w:strike/>
         </w:rPr>
         <w:t>Remove the unnecessary tables</w:t>
       </w:r>
@@ -468,6 +470,7 @@
         <w:rPr>
           <w:b/>
           <w:bCs/>
+          <w:strike/>
         </w:rPr>
         <w:t xml:space="preserve"> in the database</w:t>
       </w:r>
@@ -482,12 +485,14 @@
         <w:rPr>
           <w:b/>
           <w:bCs/>
-        </w:rPr>
-      </w:pPr>
-      <w:r>
-        <w:rPr>
-          <w:b/>
-          <w:bCs/>
+          <w:strike/>
+        </w:rPr>
+      </w:pPr>
+      <w:r>
+        <w:rPr>
+          <w:b/>
+          <w:bCs/>
+          <w:strike/>
         </w:rPr>
         <w:t>Computed Details Table</w:t>
       </w:r>
@@ -502,12 +507,14 @@
         <w:rPr>
           <w:b/>
           <w:bCs/>
-        </w:rPr>
-      </w:pPr>
-      <w:r>
-        <w:rPr>
-          <w:b/>
-          <w:bCs/>
+          <w:strike/>
+        </w:rPr>
+      </w:pPr>
+      <w:r>
+        <w:rPr>
+          <w:b/>
+          <w:bCs/>
+          <w:strike/>
         </w:rPr>
         <w:t>Departments Table</w:t>
       </w:r>
@@ -561,6 +568,70 @@
       </w:r>
       <w:r>
         <w:t xml:space="preserve"> </w:t>
+      </w:r>
+    </w:p>
+    <w:p>
+      <w:pPr>
+        <w:pStyle w:val="ListParagraph"/>
+        <w:numPr>
+          <w:ilvl w:val="1"/>
+          <w:numId w:val="1"/>
+        </w:numPr>
+      </w:pPr>
+      <w:r>
+        <w:rPr>
+          <w:b/>
+          <w:bCs/>
+        </w:rPr>
+        <w:t>Fix the following</w:t>
+      </w:r>
+    </w:p>
+    <w:p>
+      <w:pPr>
+        <w:pStyle w:val="ListParagraph"/>
+        <w:numPr>
+          <w:ilvl w:val="2"/>
+          <w:numId w:val="1"/>
+        </w:numPr>
+      </w:pPr>
+      <w:r>
+        <w:rPr>
+          <w:b/>
+          <w:bCs/>
+        </w:rPr>
+        <w:t>Raw Materials</w:t>
+      </w:r>
+    </w:p>
+    <w:p>
+      <w:pPr>
+        <w:pStyle w:val="ListParagraph"/>
+        <w:numPr>
+          <w:ilvl w:val="2"/>
+          <w:numId w:val="1"/>
+        </w:numPr>
+      </w:pPr>
+      <w:r>
+        <w:rPr>
+          <w:b/>
+          <w:bCs/>
+        </w:rPr>
+        <w:t>Warehouses</w:t>
+      </w:r>
+    </w:p>
+    <w:p>
+      <w:pPr>
+        <w:pStyle w:val="ListParagraph"/>
+        <w:numPr>
+          <w:ilvl w:val="2"/>
+          <w:numId w:val="1"/>
+        </w:numPr>
+      </w:pPr>
+      <w:r>
+        <w:rPr>
+          <w:b/>
+          <w:bCs/>
+        </w:rPr>
+        <w:t>Status</w:t>
       </w:r>
     </w:p>
     <w:sectPr>

</xml_diff>

<commit_message>
Improved the performance for the Receiving Form and Outgoing Form tabs
</commit_message>
<xml_diff>
--- a/documentations/Additional Features for Warehouse Program.docx
+++ b/documentations/Additional Features for Warehouse Program.docx
@@ -126,9 +126,11 @@
           <w:numId w:val="1"/>
         </w:numPr>
       </w:pPr>
+      <w:proofErr w:type="spellStart"/>
       <w:r>
         <w:t>Droplist</w:t>
       </w:r>
+      <w:proofErr w:type="spellEnd"/>
     </w:p>
     <w:p>
       <w:pPr>
@@ -441,7 +443,23 @@
         <w:pStyle w:val="ListParagraph"/>
       </w:pPr>
       <w:r>
-        <w:t>When the user uploaded a new beginning SOH and the Raw Material Code that are in that Beginning SOH are not existing in the database, the program should automatically create that RM code in the tbl_raw_materials table and also create a record in the tbl_stock_on_hand table.</w:t>
+        <w:t xml:space="preserve">When the user uploaded a new beginning SOH and the Raw Material Code that are in that Beginning SOH are not existing in the database, the program should automatically create that RM code in the </w:t>
+      </w:r>
+      <w:proofErr w:type="spellStart"/>
+      <w:r>
+        <w:t>tbl_raw_materials</w:t>
+      </w:r>
+      <w:proofErr w:type="spellEnd"/>
+      <w:r>
+        <w:t xml:space="preserve"> table and also create a record in the </w:t>
+      </w:r>
+      <w:proofErr w:type="spellStart"/>
+      <w:r>
+        <w:t>tbl_stock_on_hand</w:t>
+      </w:r>
+      <w:proofErr w:type="spellEnd"/>
+      <w:r>
+        <w:t xml:space="preserve"> table.</w:t>
       </w:r>
     </w:p>
     <w:p/>
@@ -632,6 +650,126 @@
           <w:bCs/>
         </w:rPr>
         <w:t>Status</w:t>
+      </w:r>
+    </w:p>
+    <w:p>
+      <w:pPr>
+        <w:pStyle w:val="ListParagraph"/>
+        <w:numPr>
+          <w:ilvl w:val="1"/>
+          <w:numId w:val="1"/>
+        </w:numPr>
+      </w:pPr>
+      <w:r>
+        <w:rPr>
+          <w:b/>
+          <w:bCs/>
+        </w:rPr>
+        <w:t>This is the modules:</w:t>
+      </w:r>
+    </w:p>
+    <w:p>
+      <w:pPr>
+        <w:pStyle w:val="ListParagraph"/>
+        <w:numPr>
+          <w:ilvl w:val="2"/>
+          <w:numId w:val="1"/>
+        </w:numPr>
+        <w:rPr>
+          <w:strike/>
+        </w:rPr>
+      </w:pPr>
+      <w:r>
+        <w:rPr>
+          <w:b/>
+          <w:bCs/>
+          <w:strike/>
+        </w:rPr>
+        <w:t>Receiving Form</w:t>
+      </w:r>
+    </w:p>
+    <w:p>
+      <w:pPr>
+        <w:pStyle w:val="ListParagraph"/>
+        <w:numPr>
+          <w:ilvl w:val="2"/>
+          <w:numId w:val="1"/>
+        </w:numPr>
+        <w:rPr>
+          <w:strike/>
+        </w:rPr>
+      </w:pPr>
+      <w:r>
+        <w:rPr>
+          <w:b/>
+          <w:bCs/>
+          <w:strike/>
+        </w:rPr>
+        <w:t>Outgoing Form</w:t>
+      </w:r>
+    </w:p>
+    <w:p>
+      <w:pPr>
+        <w:pStyle w:val="ListParagraph"/>
+        <w:numPr>
+          <w:ilvl w:val="2"/>
+          <w:numId w:val="1"/>
+        </w:numPr>
+      </w:pPr>
+      <w:r>
+        <w:rPr>
+          <w:b/>
+          <w:bCs/>
+        </w:rPr>
+        <w:t>Change of Status</w:t>
+      </w:r>
+    </w:p>
+    <w:p>
+      <w:pPr>
+        <w:pStyle w:val="ListParagraph"/>
+        <w:numPr>
+          <w:ilvl w:val="2"/>
+          <w:numId w:val="1"/>
+        </w:numPr>
+      </w:pPr>
+      <w:r>
+        <w:rPr>
+          <w:b/>
+          <w:bCs/>
+        </w:rPr>
+        <w:t>Held Form</w:t>
+      </w:r>
+    </w:p>
+    <w:p>
+      <w:pPr>
+        <w:pStyle w:val="ListParagraph"/>
+        <w:numPr>
+          <w:ilvl w:val="2"/>
+          <w:numId w:val="1"/>
+        </w:numPr>
+      </w:pPr>
+      <w:r>
+        <w:rPr>
+          <w:b/>
+          <w:bCs/>
+        </w:rPr>
+        <w:t>Preparation Form</w:t>
+      </w:r>
+    </w:p>
+    <w:p>
+      <w:pPr>
+        <w:pStyle w:val="ListParagraph"/>
+        <w:numPr>
+          <w:ilvl w:val="2"/>
+          <w:numId w:val="1"/>
+        </w:numPr>
+      </w:pPr>
+      <w:r>
+        <w:rPr>
+          <w:b/>
+          <w:bCs/>
+        </w:rPr>
+        <w:t>Transfer Form</w:t>
       </w:r>
     </w:p>
     <w:sectPr>

</xml_diff>

<commit_message>
HISTORICAL DATA MODULE: Finnished The Historical Data Module
This commit contains the latest code for the historical data.
The following tabs that are completed are as follows:
1. Preparation Form
2. Receiving Form
3. Transfer Form
4. Outgoing Form
5. Change of Status Form
6. Notes Form
</commit_message>
<xml_diff>
--- a/documentations/Additional Features for Warehouse Program.docx
+++ b/documentations/Additional Features for Warehouse Program.docx
@@ -35,7 +35,21 @@
           <w:b/>
           <w:bCs/>
         </w:rPr>
-        <w:t xml:space="preserve">Date – can choose date using clicking mouse and keyboard. </w:t>
+        <w:t>Date – can choose date using clicking mouse and keyboard</w:t>
+      </w:r>
+      <w:r>
+        <w:rPr>
+          <w:b/>
+          <w:bCs/>
+        </w:rPr>
+        <w:t xml:space="preserve"> (DEADLINE - TODAY)</w:t>
+      </w:r>
+      <w:r>
+        <w:rPr>
+          <w:b/>
+          <w:bCs/>
+        </w:rPr>
+        <w:t xml:space="preserve"> </w:t>
       </w:r>
     </w:p>
     <w:p>
@@ -132,11 +146,9 @@
           <w:numId w:val="1"/>
         </w:numPr>
       </w:pPr>
-      <w:proofErr w:type="spellStart"/>
       <w:r>
         <w:t>Droplist</w:t>
       </w:r>
-      <w:proofErr w:type="spellEnd"/>
     </w:p>
     <w:p>
       <w:pPr>
@@ -187,6 +199,13 @@
         </w:rPr>
         <w:t>HISTORICAL DATA MODULE</w:t>
       </w:r>
+      <w:r>
+        <w:rPr>
+          <w:b/>
+          <w:bCs/>
+        </w:rPr>
+        <w:t xml:space="preserve"> (DEADLINE - TODAY)</w:t>
+      </w:r>
     </w:p>
     <w:p>
       <w:pPr>
@@ -342,6 +361,29 @@
           <w:b/>
           <w:bCs/>
         </w:rPr>
+        <w:t>UI</w:t>
+      </w:r>
+      <w:r>
+        <w:rPr>
+          <w:b/>
+          <w:bCs/>
+        </w:rPr>
+        <w:t xml:space="preserve"> IMPROVEMENT</w:t>
+      </w:r>
+    </w:p>
+    <w:p>
+      <w:pPr>
+        <w:pStyle w:val="ListParagraph"/>
+        <w:rPr>
+          <w:b/>
+          <w:bCs/>
+        </w:rPr>
+      </w:pPr>
+      <w:r>
+        <w:rPr>
+          <w:b/>
+          <w:bCs/>
+        </w:rPr>
         <w:t>The forms should look like the form from the act</w:t>
       </w:r>
       <w:r>
@@ -455,37 +497,13 @@
         <w:pStyle w:val="ListParagraph"/>
       </w:pPr>
       <w:r>
-        <w:t xml:space="preserve">When the user uploaded a new beginning SOH and the Raw Material Code that are in that Beginning SOH are not existing in the database, the program should </w:t>
-      </w:r>
-      <w:proofErr w:type="gramStart"/>
-      <w:r>
-        <w:t>automatically</w:t>
+        <w:t>When the user uploaded a new beginning SOH and the Raw Material Code that are in that Beginning SOH are not existing in the database, the program should automatically</w:t>
       </w:r>
       <w:r>
         <w:t xml:space="preserve"> </w:t>
       </w:r>
       <w:r>
-        <w:t xml:space="preserve"> create</w:t>
-      </w:r>
-      <w:proofErr w:type="gramEnd"/>
-      <w:r>
-        <w:t xml:space="preserve"> that RM code in the </w:t>
-      </w:r>
-      <w:proofErr w:type="spellStart"/>
-      <w:r>
-        <w:t>tbl_raw_materials</w:t>
-      </w:r>
-      <w:proofErr w:type="spellEnd"/>
-      <w:r>
-        <w:t xml:space="preserve"> table and also create a record in the </w:t>
-      </w:r>
-      <w:proofErr w:type="spellStart"/>
-      <w:r>
-        <w:t>tbl_stock_on_hand</w:t>
-      </w:r>
-      <w:proofErr w:type="spellEnd"/>
-      <w:r>
-        <w:t xml:space="preserve"> table.</w:t>
+        <w:t xml:space="preserve"> create that RM code in the tbl_raw_materials table and also create a record in the tbl_stock_on_hand table.</w:t>
       </w:r>
     </w:p>
     <w:p/>
@@ -508,6 +526,7 @@
           <w:bCs/>
           <w:strike/>
         </w:rPr>
+        <w:lastRenderedPageBreak/>
         <w:t>Remove the unnecessary tables</w:t>
       </w:r>
       <w:r>
@@ -538,7 +557,6 @@
           <w:bCs/>
           <w:strike/>
         </w:rPr>
-        <w:lastRenderedPageBreak/>
         <w:t>Computed Details Table</w:t>
       </w:r>
     </w:p>
@@ -834,6 +852,14 @@
           <w:strike/>
         </w:rPr>
         <w:t>Transfer Fo</w:t>
+      </w:r>
+      <w:r>
+        <w:rPr>
+          <w:b/>
+          <w:bCs/>
+          <w:strike/>
+        </w:rPr>
+        <w:t>rm</w:t>
       </w:r>
     </w:p>
     <w:sectPr>

</xml_diff>